<commit_message>
install.sh: TSDuck for Debian 12 is 3.39-3956, the last release built for it
Found by the clean install test: the newest tag (3.45) has no assets, and
3.44 builds only for Debian 13 and Ubuntu, so the download 404'd.

Co-Authored-By: Claude Opus 5.5 <noreply@anthropic.com>
Claude-Session: https://claude.ai/code/session_01Ah3RWauccyreTdigt69pB9
</commit_message>
<xml_diff>
--- a/docs/lynx_tx_install_guide.docx
+++ b/docs/lynx_tx_install_guide.docx
@@ -1053,7 +1053,7 @@
       </w:r>
       <w:r>
         <w:rPr/>
-        <w:t xml:space="preserve">) is not in Debian: install the arm64 package for Debian 12 from the </w:t>
+        <w:t xml:space="preserve">) is not in Debian, and its newer releases no longer build for Debian 12: use 3.39-3956, the last that does, from the </w:t>
       </w:r>
       <w:hyperlink r:id="rId14">
         <w:r>
@@ -1066,13 +1066,23 @@
       </w:hyperlink>
       <w:r>
         <w:rPr/>
-        <w:t xml:space="preserve"> with </w:t>
-      </w:r>
-      <w:r>
-        <w:rPr>
-          <w:rFonts w:ascii="Consolas" w:hAnsi="Consolas"/>
-        </w:rPr>
-        <w:t>sudo apt install ./tsduck_*_arm64.deb</w:t>
+        <w:t xml:space="preserve"> (</w:t>
+      </w:r>
+      <w:r>
+        <w:rPr>
+          <w:rFonts w:ascii="Consolas" w:hAnsi="Consolas"/>
+        </w:rPr>
+        <w:t>tsduck_3.39-3956.debian12_arm64.deb</w:t>
+      </w:r>
+      <w:r>
+        <w:rPr/>
+        <w:t xml:space="preserve">), with </w:t>
+      </w:r>
+      <w:r>
+        <w:rPr>
+          <w:rFonts w:ascii="Consolas" w:hAnsi="Consolas"/>
+        </w:rPr>
+        <w:t>sudo apt install ./tsduck_3.39-3956.debian12_arm64.deb</w:t>
       </w:r>
       <w:r>
         <w:rPr/>

</xml_diff>

<commit_message>
Clean install proven: about 15 minutes, no warnings; guide timings and ssh host-key note
Co-Authored-By: Claude Opus 5.5 <noreply@anthropic.com>
Claude-Session: https://claude.ai/code/session_01Ah3RWauccyreTdigt69pB9
</commit_message>
<xml_diff>
--- a/docs/lynx_tx_install_guide.docx
+++ b/docs/lynx_tx_install_guide.docx
@@ -812,7 +812,7 @@
           <w:i/>
           <w:sz w:val="20"/>
         </w:rPr>
-        <w:t>About an hour on a fresh ROCK, most of it compiling. Leave it running; if your ssh connection drops, run the command again: it carries on where it left off.</w:t>
+        <w:t>About 15 minutes on a fresh ROCK, most of it compiling. Leave it running; if your ssh connection drops, run the command again: it carries on where it left off.</w:t>
       </w:r>
     </w:p>
     <w:p>
@@ -1237,7 +1237,7 @@
       </w:r>
       <w:r>
         <w:rPr/>
-        <w:t xml:space="preserve"> Ron Economos W6RZ's gr-atsc3, built from source (about half an hour). DVB-S2 uses his gr-dtv blocks, which come with GNU Radio.</w:t>
+        <w:t xml:space="preserve"> Ron Economos W6RZ's gr-atsc3, built from source (a few minutes). DVB-S2 uses his gr-dtv blocks, which come with GNU Radio.</w:t>
       </w:r>
     </w:p>
     <w:p>
@@ -3302,7 +3302,7 @@
         <w:pStyle w:val="Heading2"/>
       </w:pPr>
       <w:r>
-        <w:t>11.2 "The Rockchip hardware encoder (mpph265enc) is missing"</w:t>
+        <w:t>11.2 ssh refuses: "REMOTE HOST IDENTIFICATION HAS CHANGED"</w:t>
       </w:r>
     </w:p>
     <w:p>
@@ -3311,6 +3311,33 @@
       </w:pPr>
       <w:r>
         <w:rPr/>
+        <w:t xml:space="preserve">After re-flashing the ROCK, your computer still remembers the old one at that address. Forget it, then connect again: </w:t>
+      </w:r>
+      <w:r>
+        <w:rPr>
+          <w:rFonts w:ascii="Consolas" w:hAnsi="Consolas"/>
+        </w:rPr>
+        <w:t>ssh-keygen -R 192.168.1.XXX</w:t>
+      </w:r>
+      <w:r>
+        <w:rPr/>
+        <w:t xml:space="preserve"> (the ROCK's address).</w:t>
+      </w:r>
+    </w:p>
+    <w:p>
+      <w:pPr>
+        <w:pStyle w:val="Heading2"/>
+      </w:pPr>
+      <w:r>
+        <w:t>11.3 "The Rockchip hardware encoder (mpph265enc) is missing"</w:t>
+      </w:r>
+    </w:p>
+    <w:p>
+      <w:pPr>
+        <w:spacing w:after="150"/>
+      </w:pPr>
+      <w:r>
+        <w:rPr/>
         <w:t>The ROCK is not running Radxa's own Debian 12 image. Re-flash with the image in Section 2.</w:t>
       </w:r>
     </w:p>
@@ -3319,7 +3346,7 @@
         <w:pStyle w:val="Heading2"/>
       </w:pPr>
       <w:r>
-        <w:t>11.3 The SDR does not appear on the Transmit card</w:t>
+        <w:t>11.4 The SDR does not appear on the Transmit card</w:t>
       </w:r>
     </w:p>
     <w:p>
@@ -3441,7 +3468,7 @@
         <w:pStyle w:val="Heading2"/>
       </w:pPr>
       <w:r>
-        <w:t>11.4 Password refused on the SDR</w:t>
+        <w:t>11.5 Password refused on the SDR</w:t>
       </w:r>
     </w:p>
     <w:p>
@@ -3508,7 +3535,7 @@
         <w:pStyle w:val="Heading2"/>
       </w:pPr>
       <w:r>
-        <w:t>11.5 ATSC 3.0 locks but will not decode, or combs</w:t>
+        <w:t>11.6 ATSC 3.0 locks but will not decode, or combs</w:t>
       </w:r>
     </w:p>
     <w:p>
@@ -3568,7 +3595,7 @@
         <w:pStyle w:val="Heading2"/>
       </w:pPr>
       <w:r>
-        <w:t>11.6 The signal is twice as wide and never locks (LibreSDR)</w:t>
+        <w:t>11.7 The signal is twice as wide and never locks (LibreSDR)</w:t>
       </w:r>
     </w:p>
     <w:p>
@@ -3625,7 +3652,7 @@
         <w:pStyle w:val="Heading2"/>
       </w:pPr>
       <w:r>
-        <w:t>11.7 The page shows LOCKOUT</w:t>
+        <w:t>11.8 The page shows LOCKOUT</w:t>
       </w:r>
     </w:p>
     <w:p>
@@ -3652,7 +3679,7 @@
         <w:pStyle w:val="Heading2"/>
       </w:pPr>
       <w:r>
-        <w:t>11.8 Off frequency</w:t>
+        <w:t>11.9 Off frequency</w:t>
       </w:r>
     </w:p>
     <w:p>
@@ -3679,7 +3706,7 @@
         <w:pStyle w:val="Heading2"/>
       </w:pPr>
       <w:r>
-        <w:t>11.9 Checking logs generally</w:t>
+        <w:t>11.10 Checking logs generally</w:t>
       </w:r>
     </w:p>
     <w:p>

</xml_diff>

<commit_message>
install.sh: ask to restart when the 4K memory setting needs it (Enter = yes)
Found by the clean install test: one line among the closing messages was
easy to miss, and an ATSC 3.0 test then ran before the restart.

Co-Authored-By: Claude Opus 5.5 <noreply@anthropic.com>
Claude-Session: https://claude.ai/code/session_01Ah3RWauccyreTdigt69pB9
</commit_message>
<xml_diff>
--- a/docs/lynx_tx_install_guide.docx
+++ b/docs/lynx_tx_install_guide.docx
@@ -821,27 +821,17 @@
       </w:pPr>
       <w:r>
         <w:rPr/>
-        <w:t xml:space="preserve">It finishes by printing the page's address, and lists anything that needs a look. </w:t>
-      </w:r>
-      <w:r>
-        <w:rPr>
-          <w:b/>
-        </w:rPr>
-        <w:t>Restart the ROCK once</w:t>
-      </w:r>
-      <w:r>
-        <w:rPr/>
-        <w:t xml:space="preserve"> when it asks (</w:t>
-      </w:r>
-      <w:r>
-        <w:rPr>
-          <w:rFonts w:ascii="Consolas" w:hAnsi="Consolas"/>
-        </w:rPr>
-        <w:t>sudo reboot</w:t>
-      </w:r>
-      <w:r>
-        <w:rPr/>
-        <w:t>): the memory setting for 4K needs it.</w:t>
+        <w:t xml:space="preserve">It finishes by printing the page's address, and lists anything that needs a look. On a first install it then asks </w:t>
+      </w:r>
+      <w:r>
+        <w:rPr>
+          <w:b/>
+        </w:rPr>
+        <w:t>Restart now? [Y/n]</w:t>
+      </w:r>
+      <w:r>
+        <w:rPr/>
+        <w:t>: press Enter. The memory setting for 4K only takes effect after a restart, and transmitting before it can freeze the ROCK.</w:t>
       </w:r>
     </w:p>
     <w:p>

</xml_diff>

<commit_message>
The SDR gets 192.168.254.2 again: NetworkManager's own range, lowest-first
Found by the clean install test: NetworkManager's shared mode runs dnsmasq
with its own .10-.254 range, so our dhcp-range only added a second one and
the Sky got .236. ipv4.shared-dhcp-range (.2-.20) replaces it, and
dhcp-sequential-ip hands out .2 first; a replacement board gets .3 while
the old lease lasts.

Co-Authored-By: Claude Opus 5.5 <noreply@anthropic.com>
Claude-Session: https://claude.ai/code/session_01Ah3RWauccyreTdigt69pB9
</commit_message>
<xml_diff>
--- a/docs/lynx_tx_install_guide.docx
+++ b/docs/lynx_tx_install_guide.docx
@@ -1697,8 +1697,8 @@
         </w:tblBorders>
       </w:tblPr>
       <w:tblGrid>
-        <w:gridCol w:w="2703"/>
-        <w:gridCol w:w="6656"/>
+        <w:gridCol w:w="2117"/>
+        <w:gridCol w:w="7242"/>
       </w:tblGrid>
       <w:tr>
         <w:trPr>
@@ -1706,8 +1706,8 @@
         </w:trPr>
         <w:tc>
           <w:tcPr>
-            <w:tcW w:type="dxa" w:w="2703"/>
-            <w:tcW w:type="dxa" w:w="2703"/>
+            <w:tcW w:type="dxa" w:w="2117"/>
+            <w:tcW w:type="dxa" w:w="2117"/>
             <w:shd w:fill="2C3E50" w:val="clear"/>
           </w:tcPr>
           <w:p>
@@ -1723,8 +1723,8 @@
         </w:tc>
         <w:tc>
           <w:tcPr>
-            <w:tcW w:type="dxa" w:w="6656"/>
-            <w:tcW w:type="dxa" w:w="6656"/>
+            <w:tcW w:type="dxa" w:w="7242"/>
+            <w:tcW w:type="dxa" w:w="7242"/>
             <w:shd w:fill="2C3E50" w:val="clear"/>
           </w:tcPr>
           <w:p>
@@ -1742,8 +1742,8 @@
       <w:tr>
         <w:tc>
           <w:tcPr>
-            <w:tcW w:type="dxa" w:w="2703"/>
-            <w:tcW w:type="dxa" w:w="2703"/>
+            <w:tcW w:type="dxa" w:w="2117"/>
+            <w:tcW w:type="dxa" w:w="2117"/>
           </w:tcPr>
           <w:p>
             <w:r>
@@ -1756,8 +1756,8 @@
         </w:tc>
         <w:tc>
           <w:tcPr>
-            <w:tcW w:type="dxa" w:w="6656"/>
-            <w:tcW w:type="dxa" w:w="6656"/>
+            <w:tcW w:type="dxa" w:w="7242"/>
+            <w:tcW w:type="dxa" w:w="7242"/>
           </w:tcPr>
           <w:p>
             <w:r>
@@ -1772,8 +1772,8 @@
       <w:tr>
         <w:tc>
           <w:tcPr>
-            <w:tcW w:type="dxa" w:w="2703"/>
-            <w:tcW w:type="dxa" w:w="2703"/>
+            <w:tcW w:type="dxa" w:w="2117"/>
+            <w:tcW w:type="dxa" w:w="2117"/>
           </w:tcPr>
           <w:p>
             <w:r>
@@ -1786,15 +1786,15 @@
         </w:tc>
         <w:tc>
           <w:tcPr>
-            <w:tcW w:type="dxa" w:w="6656"/>
-            <w:tcW w:type="dxa" w:w="6656"/>
-          </w:tcPr>
-          <w:p>
-            <w:r>
-              <w:rPr>
-                <w:sz w:val="20"/>
-              </w:rPr>
-              <w:t>192.168.254.x, given by the ROCK (DHCP)</w:t>
+            <w:tcW w:type="dxa" w:w="7242"/>
+            <w:tcW w:type="dxa" w:w="7242"/>
+          </w:tcPr>
+          <w:p>
+            <w:r>
+              <w:rPr>
+                <w:sz w:val="20"/>
+              </w:rPr>
+              <w:t>192.168.254.2, given by the ROCK (DHCP). A replacement board gets .3 for a while</w:t>
             </w:r>
           </w:p>
         </w:tc>
@@ -1855,22 +1855,6 @@
           <w:rFonts w:ascii="Consolas" w:hAnsi="Consolas"/>
           <w:sz w:val="20"/>
         </w:rPr>
-        <w:t>echo 'dhcp-range=192.168.254.2,192.168.254.2,12h' | \</w:t>
-        <w:br/>
-      </w:r>
-      <w:r>
-        <w:rPr>
-          <w:rFonts w:ascii="Consolas" w:hAnsi="Consolas"/>
-          <w:sz w:val="20"/>
-        </w:rPr>
-        <w:t xml:space="preserve">    sudo tee /etc/NetworkManager/dnsmasq-shared.d/lynx-sdr.conf</w:t>
-        <w:br/>
-      </w:r>
-      <w:r>
-        <w:rPr>
-          <w:rFonts w:ascii="Consolas" w:hAnsi="Consolas"/>
-          <w:sz w:val="20"/>
-        </w:rPr>
         <w:t>sudo nmcli con add type ethernet ifname enP4p65s0 con-name lynx-sdr \</w:t>
         <w:br/>
       </w:r>
@@ -1879,7 +1863,7 @@
           <w:rFonts w:ascii="Consolas" w:hAnsi="Consolas"/>
           <w:sz w:val="20"/>
         </w:rPr>
-        <w:t xml:space="preserve">    ipv4.method shared ipv4.addresses 192.168.254.1/24 ipv6.method disabled</w:t>
+        <w:t xml:space="preserve">    ipv4.method shared ipv4.addresses 192.168.254.1/24 ipv6.method disabled \</w:t>
         <w:br/>
       </w:r>
       <w:r>
@@ -1887,7 +1871,42 @@
           <w:rFonts w:ascii="Consolas" w:hAnsi="Consolas"/>
           <w:sz w:val="20"/>
         </w:rPr>
+        <w:t xml:space="preserve">    ipv4.shared-dhcp-range 192.168.254.2,192.168.254.20</w:t>
+        <w:br/>
+      </w:r>
+      <w:r>
+        <w:rPr>
+          <w:rFonts w:ascii="Consolas" w:hAnsi="Consolas"/>
+          <w:sz w:val="20"/>
+        </w:rPr>
+        <w:t>echo dhcp-sequential-ip | sudo tee /etc/NetworkManager/dnsmasq-shared.d/lynx-sdr.conf</w:t>
+        <w:br/>
+      </w:r>
+      <w:r>
+        <w:rPr>
+          <w:rFonts w:ascii="Consolas" w:hAnsi="Consolas"/>
+          <w:sz w:val="20"/>
+        </w:rPr>
         <w:t>sudo nmcli con up lynx-sdr</w:t>
+      </w:r>
+    </w:p>
+    <w:p>
+      <w:pPr>
+        <w:spacing w:after="150"/>
+      </w:pPr>
+      <w:r>
+        <w:rPr/>
+        <w:t xml:space="preserve">If Radxa's automatic "Wired connection 2" is on the same port, delete it: </w:t>
+      </w:r>
+      <w:r>
+        <w:rPr>
+          <w:rFonts w:ascii="Consolas" w:hAnsi="Consolas"/>
+        </w:rPr>
+        <w:t>sudo nmcli con delete "Wired connection 2"</w:t>
+      </w:r>
+      <w:r>
+        <w:rPr/>
+        <w:t>.</w:t>
       </w:r>
     </w:p>
     <w:p>

</xml_diff>

<commit_message>
Update button like the Receiver's; the SDR's .2 by a reservation
Update: Check updates (manual, never automatic), then Update pulls the
branch this ROCK is on (fast-forward only) and restarts Lynx-Tx. Off air
only. The installer's sudoers rule adds systemctl restart lynx-tx; an
older install falls back to the allowed reboot.

SDR address: the clean install still gave .10 (NetworkManager's own range
wins), so the dnsmasq drop-in is now a reservation for any MAC at .2.

Co-Authored-By: Claude Opus 5.5 <noreply@anthropic.com>
Claude-Session: https://claude.ai/code/session_01Ah3RWauccyreTdigt69pB9
</commit_message>
<xml_diff>
--- a/docs/lynx_tx_install_guide.docx
+++ b/docs/lynx_tx_install_guide.docx
@@ -1697,8 +1697,8 @@
         </w:tblBorders>
       </w:tblPr>
       <w:tblGrid>
-        <w:gridCol w:w="2117"/>
-        <w:gridCol w:w="7242"/>
+        <w:gridCol w:w="1814"/>
+        <w:gridCol w:w="7545"/>
       </w:tblGrid>
       <w:tr>
         <w:trPr>
@@ -1706,8 +1706,8 @@
         </w:trPr>
         <w:tc>
           <w:tcPr>
-            <w:tcW w:type="dxa" w:w="2117"/>
-            <w:tcW w:type="dxa" w:w="2117"/>
+            <w:tcW w:type="dxa" w:w="1814"/>
+            <w:tcW w:type="dxa" w:w="1814"/>
             <w:shd w:fill="2C3E50" w:val="clear"/>
           </w:tcPr>
           <w:p>
@@ -1723,8 +1723,8 @@
         </w:tc>
         <w:tc>
           <w:tcPr>
-            <w:tcW w:type="dxa" w:w="7242"/>
-            <w:tcW w:type="dxa" w:w="7242"/>
+            <w:tcW w:type="dxa" w:w="7545"/>
+            <w:tcW w:type="dxa" w:w="7545"/>
             <w:shd w:fill="2C3E50" w:val="clear"/>
           </w:tcPr>
           <w:p>
@@ -1742,8 +1742,8 @@
       <w:tr>
         <w:tc>
           <w:tcPr>
-            <w:tcW w:type="dxa" w:w="2117"/>
-            <w:tcW w:type="dxa" w:w="2117"/>
+            <w:tcW w:type="dxa" w:w="1814"/>
+            <w:tcW w:type="dxa" w:w="1814"/>
           </w:tcPr>
           <w:p>
             <w:r>
@@ -1756,8 +1756,8 @@
         </w:tc>
         <w:tc>
           <w:tcPr>
-            <w:tcW w:type="dxa" w:w="7242"/>
-            <w:tcW w:type="dxa" w:w="7242"/>
+            <w:tcW w:type="dxa" w:w="7545"/>
+            <w:tcW w:type="dxa" w:w="7545"/>
           </w:tcPr>
           <w:p>
             <w:r>
@@ -1772,8 +1772,8 @@
       <w:tr>
         <w:tc>
           <w:tcPr>
-            <w:tcW w:type="dxa" w:w="2117"/>
-            <w:tcW w:type="dxa" w:w="2117"/>
+            <w:tcW w:type="dxa" w:w="1814"/>
+            <w:tcW w:type="dxa" w:w="1814"/>
           </w:tcPr>
           <w:p>
             <w:r>
@@ -1786,15 +1786,15 @@
         </w:tc>
         <w:tc>
           <w:tcPr>
-            <w:tcW w:type="dxa" w:w="7242"/>
-            <w:tcW w:type="dxa" w:w="7242"/>
-          </w:tcPr>
-          <w:p>
-            <w:r>
-              <w:rPr>
-                <w:sz w:val="20"/>
-              </w:rPr>
-              <w:t>192.168.254.2, given by the ROCK (DHCP). A replacement board gets .3 for a while</w:t>
+            <w:tcW w:type="dxa" w:w="7545"/>
+            <w:tcW w:type="dxa" w:w="7545"/>
+          </w:tcPr>
+          <w:p>
+            <w:r>
+              <w:rPr>
+                <w:sz w:val="20"/>
+              </w:rPr>
+              <w:t>192.168.254.2, given by the ROCK (DHCP). A replacement board gets another address for a while; the Transmit card shows it</w:t>
             </w:r>
           </w:p>
         </w:tc>
@@ -1863,7 +1863,7 @@
           <w:rFonts w:ascii="Consolas" w:hAnsi="Consolas"/>
           <w:sz w:val="20"/>
         </w:rPr>
-        <w:t xml:space="preserve">    ipv4.method shared ipv4.addresses 192.168.254.1/24 ipv6.method disabled \</w:t>
+        <w:t xml:space="preserve">    ipv4.method shared ipv4.addresses 192.168.254.1/24 ipv6.method disabled</w:t>
         <w:br/>
       </w:r>
       <w:r>
@@ -1871,15 +1871,7 @@
           <w:rFonts w:ascii="Consolas" w:hAnsi="Consolas"/>
           <w:sz w:val="20"/>
         </w:rPr>
-        <w:t xml:space="preserve">    ipv4.shared-dhcp-range 192.168.254.2,192.168.254.20</w:t>
-        <w:br/>
-      </w:r>
-      <w:r>
-        <w:rPr>
-          <w:rFonts w:ascii="Consolas" w:hAnsi="Consolas"/>
-          <w:sz w:val="20"/>
-        </w:rPr>
-        <w:t>echo dhcp-sequential-ip | sudo tee /etc/NetworkManager/dnsmasq-shared.d/lynx-sdr.conf</w:t>
+        <w:t>echo 'dhcp-host=*:*:*:*:*:*,192.168.254.2' | sudo tee /etc/NetworkManager/dnsmasq-shared.d/lynx-sdr.conf</w:t>
         <w:br/>
       </w:r>
       <w:r>

</xml_diff>

<commit_message>
Fan control from the Lynx Receiver: hold the SoC at a steady 40 C
Radxa's image leaves the fan at PWM 255 even at 36 C (rock-5t, 23 Oct
2026). tools/lynx_fan.py is the Receiver's install/lynx_fan.py: on at
35 C at PWM 128, faster as needed to hold 40 C, off below 30 C; the
kernel's 60 C fan step and 85 C throttling stay as the safety net. The
installer adds it as lynx-fan.service with /etc/default/lynx-fan.

Co-Authored-By: Claude Opus 5.5 <noreply@anthropic.com>
Claude-Session: https://claude.ai/code/session_01Ah3RWauccyreTdigt69pB9
</commit_message>
<xml_diff>
--- a/docs/lynx_tx_install_guide.docx
+++ b/docs/lynx_tx_install_guide.docx
@@ -795,7 +795,7 @@
       </w:pPr>
       <w:r>
         <w:rPr/>
-        <w:t>It installs every package, TSDuck, the video loopback for the media player, Ron Economos W6RZ's gr-atsc3, the patched HEVC encoder, Lynx-Tx itself, the direct link to the SDR (with DHCP, so the SDR needs no setting up), SNMP monitoring, and the service that starts it at boot. It asks for your password once at the start.</w:t>
+        <w:t>It installs every package, TSDuck, the video loopback for the media player, Ron Economos W6RZ's gr-atsc3, the patched HEVC encoder, Lynx-Tx itself, the direct link to the SDR (with DHCP, so the SDR needs no setting up), SNMP monitoring, quiet fan control, and the service that starts it at boot. It asks for your password once at the start.</w:t>
       </w:r>
     </w:p>
     <w:p>
@@ -1383,7 +1383,62 @@
         <w:rPr>
           <w:b/>
         </w:rPr>
-        <w:t>9. Monitoring and the service:</w:t>
+        <w:t>9. Fan control:</w:t>
+      </w:r>
+      <w:r>
+        <w:rPr/>
+        <w:t xml:space="preserve"> Radxa's image runs the fan flat out even when the ROCK is cool. </w:t>
+      </w:r>
+      <w:r>
+        <w:rPr>
+          <w:rFonts w:ascii="Consolas" w:hAnsi="Consolas"/>
+        </w:rPr>
+        <w:t>tools/lynx_fan.py</w:t>
+      </w:r>
+      <w:r>
+        <w:rPr/>
+        <w:t xml:space="preserve"> (the same as the Lynx Receiver's) holds the processor at a steady 40 °C instead: on at 35 °C at its slowest reliable speed, faster as needed, off below 30 °C. The kernel's own fan step at 60 °C and throttling at 85 °C stay as the safety net. The installer puts it in </w:t>
+      </w:r>
+      <w:r>
+        <w:rPr>
+          <w:rFonts w:ascii="Consolas" w:hAnsi="Consolas"/>
+        </w:rPr>
+        <w:t>/usr/local/sbin/lynx-fan</w:t>
+      </w:r>
+      <w:r>
+        <w:rPr/>
+        <w:t xml:space="preserve"> with a service, </w:t>
+      </w:r>
+      <w:r>
+        <w:rPr>
+          <w:rFonts w:ascii="Consolas" w:hAnsi="Consolas"/>
+        </w:rPr>
+        <w:t>lynx-fan.service</w:t>
+      </w:r>
+      <w:r>
+        <w:rPr/>
+        <w:t xml:space="preserve">; the settings are in </w:t>
+      </w:r>
+      <w:r>
+        <w:rPr>
+          <w:rFonts w:ascii="Consolas" w:hAnsi="Consolas"/>
+        </w:rPr>
+        <w:t>/etc/default/lynx-fan</w:t>
+      </w:r>
+      <w:r>
+        <w:rPr/>
+        <w:t>.</w:t>
+      </w:r>
+    </w:p>
+    <w:p>
+      <w:pPr>
+        <w:spacing w:after="150"/>
+      </w:pPr>
+      <w:r>
+        <w:rPr>
+          <w:b/>
+        </w:rPr>
+        <w:t>10. Monitoring and the service:</w:t>
       </w:r>
       <w:r>
         <w:rPr/>
@@ -3132,7 +3187,7 @@
           <w:rFonts w:ascii="Consolas" w:hAnsi="Consolas"/>
           <w:sz w:val="20"/>
         </w:rPr>
-        <w:t>systemctl is-active lynx-tx</w:t>
+        <w:t>systemctl is-active lynx-tx lynx-fan</w:t>
         <w:br/>
       </w:r>
       <w:r>
@@ -3191,7 +3246,7 @@
       </w:r>
       <w:r>
         <w:rPr/>
-        <w:t xml:space="preserve">; the encoder's description; </w:t>
+        <w:t xml:space="preserve"> twice (Lynx-Tx and the fan control); the encoder's description; </w:t>
       </w:r>
       <w:r>
         <w:rPr>

</xml_diff>

<commit_message>
LibreSDR on Tezuka fully supported: Installation Guide 1.1, README credit SV1EIA
Co-Authored-By: Claude Opus 5.5 <noreply@anthropic.com>
Claude-Session: https://claude.ai/code/session_01Ah3RWauccyreTdigt69pB9
</commit_message>
<xml_diff>
--- a/docs/lynx_tx_install_guide.docx
+++ b/docs/lynx_tx_install_guide.docx
@@ -35,7 +35,7 @@
         <w:rPr>
           <w:b/>
         </w:rPr>
-        <w:t>Version 1.0  ·  G8YTZ / EI3IOB  ·  October 2026</w:t>
+        <w:t>Version 1.1  ·  G8YTZ / EI3IOB  ·  October 2026</w:t>
       </w:r>
     </w:p>
     <w:p>
@@ -2059,7 +2059,7 @@
         <w:rPr>
           <w:b/>
         </w:rPr>
-        <w:t>First time only, a PlutoSky:</w:t>
+        <w:t>First time only, a PlutoSky or LibreSDR on Tezuka:</w:t>
       </w:r>
       <w:r>
         <w:rPr/>
@@ -2071,7 +2071,7 @@
         <w:pStyle w:val="Heading2"/>
       </w:pPr>
       <w:r>
-        <w:t>5.4 What Lynx-Tx Does to a PlutoSky</w:t>
+        <w:t>5.4 What Lynx-Tx Does to a PlutoSky or LibreSDR</w:t>
       </w:r>
     </w:p>
     <w:p>
@@ -2130,7 +2130,7 @@
       </w:r>
       <w:r>
         <w:rPr/>
-        <w:t xml:space="preserve"> Tezuka's automatic mode re-checks the reference once a second, and each check nudges the oscillator, which ATSC 3.0 cannot tolerate. The script holds the loop locked while the 10 MHz is there, lets go within 2 s if it disappears (holdover on the board's own oscillator: still on air, a few hundred hertz adrift), and locks again once it has been back for 10 s. The page's </w:t>
+        <w:t xml:space="preserve"> ATSC 3.0 cannot tolerate the oscillator being nudged, so the script takes charge of the reference. The page's </w:t>
       </w:r>
       <w:r>
         <w:rPr>
@@ -2140,7 +2140,7 @@
       </w:r>
       <w:r>
         <w:rPr/>
-        <w:t xml:space="preserve"> lamp shows the state.</w:t>
+        <w:t xml:space="preserve"> lamp shows the state: Green locked, amber acquiring or in holdover, red unlocked.</w:t>
       </w:r>
     </w:p>
     <w:p>
@@ -2156,11 +2156,11 @@
         <w:rPr>
           <w:b/>
         </w:rPr>
-        <w:t>Starvation mute:</w:t>
-      </w:r>
-      <w:r>
-        <w:rPr/>
-        <w:t xml:space="preserve"> If the IQ stops arriving (the ROCK restarting or failing, a cable out) the board turns its transmitter off within 2 s rather than radiating junk. Lynx-Tx turns it back on at the next TX On.</w:t>
+        <w:t>PlutoSky:</w:t>
+      </w:r>
+      <w:r>
+        <w:rPr/>
+        <w:t xml:space="preserve"> Tezuka's automatic mode re-checks the reference once a second, and each check nudges the oscillator. The script holds the loop locked while the 10 MHz is there, lets go within 2 s if it disappears (holdover on the board's own oscillator: still on air, a few hundred hertz adrift), and locks again once it has been back for 10 s.</w:t>
       </w:r>
     </w:p>
     <w:p>
@@ -2176,48 +2176,28 @@
         <w:rPr>
           <w:b/>
         </w:rPr>
-        <w:t>The ROCK's SSH key,</w:t>
-      </w:r>
-      <w:r>
-        <w:rPr/>
-        <w:t xml:space="preserve"> so Lynx-Tx never needs a password. It is put there once with Tezuka's factory password (</w:t>
-      </w:r>
-      <w:r>
-        <w:rPr>
-          <w:rFonts w:ascii="Consolas" w:hAnsi="Consolas"/>
-        </w:rPr>
-        <w:t>analog</w:t>
-      </w:r>
-      <w:r>
-        <w:rPr/>
-        <w:t>).</w:t>
-      </w:r>
-    </w:p>
-    <w:p>
-      <w:pPr>
-        <w:spacing w:after="150"/>
-      </w:pPr>
-      <w:r>
-        <w:rPr/>
-        <w:t xml:space="preserve">To give the board back to plain Tezuka: over SSH, </w:t>
-      </w:r>
-      <w:r>
-        <w:rPr>
-          <w:rFonts w:ascii="Consolas" w:hAnsi="Consolas"/>
-        </w:rPr>
-        <w:t>rm /mnt/jffs2/autorun.sh</w:t>
-      </w:r>
-      <w:r>
-        <w:rPr/>
-        <w:t>, then restart it.</w:t>
-      </w:r>
-    </w:p>
-    <w:p>
-      <w:pPr>
-        <w:pStyle w:val="Heading2"/>
-      </w:pPr>
-      <w:r>
-        <w:t>5.5 LibreSDR Notes</w:t>
+        <w:t>LibreSDR:</w:t>
+      </w:r>
+      <w:r>
+        <w:rPr/>
+        <w:t xml:space="preserve"> The board steers its own oscillator to the 10 MHz (Christos SV1EIA's disciplining, which acquires the reference at start-up). After that the script does the steering, gently, and ignores any reading that makes no sense, so pulling the 10 MHz lead moves nothing: the board carries on where it was (holdover) and picks up again 10 s after the reference returns. No glitch either way (bench, 23 Oct 2026).</w:t>
+      </w:r>
+    </w:p>
+    <w:p>
+      <w:pPr>
+        <w:pBdr>
+          <w:left w:val="single" w:color="E8A33D" w:sz="12" w:space="8"/>
+        </w:pBdr>
+        <w:shd w:fill="FFF4E5" w:val="clear"/>
+        <w:spacing w:before="100" w:after="200"/>
+        <w:ind w:left="200"/>
+      </w:pPr>
+      <w:r>
+        <w:rPr>
+          <w:i/>
+          <w:sz w:val="20"/>
+        </w:rPr>
+        <w:t>Losing GNSS (the antenna, jamming, weather) never reaches the SDR: the LBE-1420 carries on giving 10 MHz from its own oscillator, so the lamp stays green and nothing on air changes. Holdover here is for the 10 MHz itself going (a lead, the GPSDO's power).</w:t>
       </w:r>
     </w:p>
     <w:p>
@@ -2233,11 +2213,88 @@
         <w:rPr>
           <w:b/>
         </w:rPr>
+        <w:t>Starvation mute:</w:t>
+      </w:r>
+      <w:r>
+        <w:rPr/>
+        <w:t xml:space="preserve"> If the IQ stops arriving (the ROCK restarting or failing, a cable out) the board turns its transmitter off within 2 s rather than radiating junk. Lynx-Tx turns it back on at the next TX On.</w:t>
+      </w:r>
+    </w:p>
+    <w:p>
+      <w:pPr>
+        <w:pStyle w:val="ListParagraph"/>
+        <w:numPr>
+          <w:ilvl w:val="0"/>
+          <w:numId w:val="2"/>
+        </w:numPr>
+        <w:spacing w:after="80"/>
+      </w:pPr>
+      <w:r>
+        <w:rPr>
+          <w:b/>
+        </w:rPr>
+        <w:t>The ROCK's SSH key,</w:t>
+      </w:r>
+      <w:r>
+        <w:rPr/>
+        <w:t xml:space="preserve"> so Lynx-Tx never needs a password. It is put there once with Tezuka's factory password (</w:t>
+      </w:r>
+      <w:r>
+        <w:rPr>
+          <w:rFonts w:ascii="Consolas" w:hAnsi="Consolas"/>
+        </w:rPr>
+        <w:t>analog</w:t>
+      </w:r>
+      <w:r>
+        <w:rPr/>
+        <w:t>).</w:t>
+      </w:r>
+    </w:p>
+    <w:p>
+      <w:pPr>
+        <w:spacing w:after="150"/>
+      </w:pPr>
+      <w:r>
+        <w:rPr/>
+        <w:t xml:space="preserve">To give the board back to plain Tezuka: over SSH, </w:t>
+      </w:r>
+      <w:r>
+        <w:rPr>
+          <w:rFonts w:ascii="Consolas" w:hAnsi="Consolas"/>
+        </w:rPr>
+        <w:t>rm /mnt/jffs2/autorun.sh</w:t>
+      </w:r>
+      <w:r>
+        <w:rPr/>
+        <w:t>, then restart it.</w:t>
+      </w:r>
+    </w:p>
+    <w:p>
+      <w:pPr>
+        <w:pStyle w:val="Heading2"/>
+      </w:pPr>
+      <w:r>
+        <w:t>5.5 LibreSDR Notes</w:t>
+      </w:r>
+    </w:p>
+    <w:p>
+      <w:pPr>
+        <w:pStyle w:val="ListParagraph"/>
+        <w:numPr>
+          <w:ilvl w:val="0"/>
+          <w:numId w:val="2"/>
+        </w:numPr>
+        <w:spacing w:after="80"/>
+      </w:pPr>
+      <w:r>
+        <w:rPr>
+          <w:b/>
+        </w:rPr>
         <w:t>With Tezuka:</w:t>
       </w:r>
       <w:r>
         <w:rPr/>
-        <w:t xml:space="preserve"> Set it up exactly as the PlutoSky. Its settings live in the board's flash, not on the card. Lynx-Tx does not yet prepare a LibreSDR by itself, so for ATSC 3.0 on a LibreSDR use DL1JM's firmware, which is clean.</w:t>
+        <w:t xml:space="preserve"> Set it up exactly as the PlutoSky; Lynx-Tx prepares it by itself (Section 5.4), and DVB-S2 and ATSC 3.0 are both clean. Its settings live in the board's flash, not on the card. Allow a minute and a half after it starts for the 10 MHz to be acquired: the lamp is amber "acquiring" until then.</w:t>
       </w:r>
     </w:p>
     <w:p>
@@ -3643,7 +3700,7 @@
       </w:pPr>
       <w:r>
         <w:rPr/>
-        <w:t>On a LibreSDR, use DL1JM's firmware for ATSC 3.0 (Section 5.5).</w:t>
+        <w:t>On a LibreSDR on DL1JM's firmware, which does not have the Lynx-Tx script: use Tezuka (Section 5.5).</w:t>
       </w:r>
     </w:p>
     <w:p>
@@ -3808,20 +3865,6 @@
       <w:r>
         <w:rPr/>
         <w:t>DVB-T2 mode (coming soon).</w:t>
-      </w:r>
-    </w:p>
-    <w:p>
-      <w:pPr>
-        <w:pStyle w:val="ListParagraph"/>
-        <w:numPr>
-          <w:ilvl w:val="0"/>
-          <w:numId w:val="2"/>
-        </w:numPr>
-        <w:spacing w:after="80"/>
-      </w:pPr>
-      <w:r>
-        <w:rPr/>
-        <w:t>Preparing a LibreSDR on Tezuka automatically, with its own reference control.</w:t>
       </w:r>
     </w:p>
     <w:p>

</xml_diff>